<commit_message>
Avance Update Word V2
</commit_message>
<xml_diff>
--- a/webapp/templates/word/Manifestación_No_Declarante.docx
+++ b/webapp/templates/word/Manifestación_No_Declarante.docx
@@ -1,6 +1,6 @@
 
 <file path=word/document.xml><?xml version="1.0" encoding="utf-8"?>
-<w:document xmlns:wpc="http://schemas.microsoft.com/office/word/2010/wordprocessingCanvas" xmlns:cx="http://schemas.microsoft.com/office/drawing/2014/chartex" xmlns:cx1="http://schemas.microsoft.com/office/drawing/2015/9/8/chartex" xmlns:cx2="http://schemas.microsoft.com/office/drawing/2015/10/21/chartex" xmlns:cx3="http://schemas.microsoft.com/office/drawing/2016/5/9/chartex" xmlns:cx4="http://schemas.microsoft.com/office/drawing/2016/5/10/chartex" xmlns:cx5="http://schemas.microsoft.com/office/drawing/2016/5/11/chartex" xmlns:cx6="http://schemas.microsoft.com/office/drawing/2016/5/12/chartex" xmlns:cx7="http://schemas.microsoft.com/office/drawing/2016/5/13/chartex" xmlns:cx8="http://schemas.microsoft.com/office/drawing/2016/5/14/chartex" xmlns:mc="http://schemas.openxmlformats.org/markup-compatibility/2006" xmlns:aink="http://schemas.microsoft.com/office/drawing/2016/ink" xmlns:am3d="http://schemas.microsoft.com/office/drawing/2017/model3d" xmlns:o="urn:schemas-microsoft-com:office:office" xmlns:r="http://schemas.openxmlformats.org/officeDocument/2006/relationships" xmlns:m="http://schemas.openxmlformats.org/officeDocument/2006/math" xmlns:v="urn:schemas-microsoft-com:vml" xmlns:wp14="http://schemas.microsoft.com/office/word/2010/wordprocessingDrawing" xmlns:wp="http://schemas.openxmlformats.org/drawingml/2006/wordprocessingDrawing" xmlns:w10="urn:schemas-microsoft-com:office:word" xmlns:w="http://schemas.openxmlformats.org/wordprocessingml/2006/main" xmlns:w14="http://schemas.microsoft.com/office/word/2010/wordml" xmlns:w15="http://schemas.microsoft.com/office/word/2012/wordml" xmlns:w16cex="http://schemas.microsoft.com/office/word/2018/wordml/cex" xmlns:w16cid="http://schemas.microsoft.com/office/word/2016/wordml/cid" xmlns:w16="http://schemas.microsoft.com/office/word/2018/wordml" xmlns:w16sdtdh="http://schemas.microsoft.com/office/word/2020/wordml/sdtdatahash" xmlns:w16se="http://schemas.microsoft.com/office/word/2015/wordml/symex" xmlns:wpg="http://schemas.microsoft.com/office/word/2010/wordprocessingGroup" xmlns:wpi="http://schemas.microsoft.com/office/word/2010/wordprocessingInk" xmlns:wne="http://schemas.microsoft.com/office/word/2006/wordml" xmlns:wps="http://schemas.microsoft.com/office/word/2010/wordprocessingShape" mc:Ignorable="w14 w15 w16se w16cid w16 w16cex w16sdtdh wp14">
+<w:document xmlns:wpc="http://schemas.microsoft.com/office/word/2010/wordprocessingCanvas" xmlns:cx="http://schemas.microsoft.com/office/drawing/2014/chartex" xmlns:cx1="http://schemas.microsoft.com/office/drawing/2015/9/8/chartex" xmlns:cx2="http://schemas.microsoft.com/office/drawing/2015/10/21/chartex" xmlns:cx3="http://schemas.microsoft.com/office/drawing/2016/5/9/chartex" xmlns:cx4="http://schemas.microsoft.com/office/drawing/2016/5/10/chartex" xmlns:cx5="http://schemas.microsoft.com/office/drawing/2016/5/11/chartex" xmlns:cx6="http://schemas.microsoft.com/office/drawing/2016/5/12/chartex" xmlns:cx7="http://schemas.microsoft.com/office/drawing/2016/5/13/chartex" xmlns:cx8="http://schemas.microsoft.com/office/drawing/2016/5/14/chartex" xmlns:mc="http://schemas.openxmlformats.org/markup-compatibility/2006" xmlns:aink="http://schemas.microsoft.com/office/drawing/2016/ink" xmlns:am3d="http://schemas.microsoft.com/office/drawing/2017/model3d" xmlns:o="urn:schemas-microsoft-com:office:office" xmlns:oel="http://schemas.microsoft.com/office/2019/extlst" xmlns:r="http://schemas.openxmlformats.org/officeDocument/2006/relationships" xmlns:m="http://schemas.openxmlformats.org/officeDocument/2006/math" xmlns:v="urn:schemas-microsoft-com:vml" xmlns:wp14="http://schemas.microsoft.com/office/word/2010/wordprocessingDrawing" xmlns:wp="http://schemas.openxmlformats.org/drawingml/2006/wordprocessingDrawing" xmlns:w10="urn:schemas-microsoft-com:office:word" xmlns:w="http://schemas.openxmlformats.org/wordprocessingml/2006/main" xmlns:w14="http://schemas.microsoft.com/office/word/2010/wordml" xmlns:w15="http://schemas.microsoft.com/office/word/2012/wordml" xmlns:w16cex="http://schemas.microsoft.com/office/word/2018/wordml/cex" xmlns:w16cid="http://schemas.microsoft.com/office/word/2016/wordml/cid" xmlns:w16="http://schemas.microsoft.com/office/word/2018/wordml" xmlns:w16sdtdh="http://schemas.microsoft.com/office/word/2020/wordml/sdtdatahash" xmlns:w16se="http://schemas.microsoft.com/office/word/2015/wordml/symex" xmlns:wpg="http://schemas.microsoft.com/office/word/2010/wordprocessingGroup" xmlns:wpi="http://schemas.microsoft.com/office/word/2010/wordprocessingInk" xmlns:wne="http://schemas.microsoft.com/office/word/2006/wordml" xmlns:wps="http://schemas.microsoft.com/office/word/2010/wordprocessingShape" mc:Ignorable="w14 w15 w16se w16cid w16 w16cex w16sdtdh wp14">
   <w:body>
     <w:p>
       <w:pPr>
@@ -144,7 +144,7 @@
         <w:rPr>
           <w:rFonts w:eastAsia="Barlow" w:cs="Barlow"/>
         </w:rPr>
-        <w:t>Work</w:t>
+        <w:t>Firma</w:t>
       </w:r>
       <w:proofErr w:type="spellEnd"/>
       <w:r>
@@ -434,13 +434,7 @@
         <w:rPr>
           <w:w w:val="105"/>
         </w:rPr>
-        <w:t>Me permito manifestar bajo la gravedad del juramento y actuando en mí calidad</w:t>
-      </w:r>
-      <w:r>
-        <w:rPr>
-          <w:w w:val="105"/>
-        </w:rPr>
-        <w:t xml:space="preserve"> de empleado de la Compañía, que </w:t>
+        <w:t xml:space="preserve">Me permito manifestar bajo la gravedad del juramento y actuando en mí calidad de empleado de la Compañía, que </w:t>
       </w:r>
       <w:r>
         <w:rPr>
@@ -632,13 +626,7 @@
         <w:rPr>
           <w:w w:val="105"/>
         </w:rPr>
-        <w:t>De igual forma me comprometo a actualizar la</w:t>
-      </w:r>
-      <w:r>
-        <w:rPr>
-          <w:w w:val="105"/>
-        </w:rPr>
-        <w:t xml:space="preserve"> información, en el caso de que mis condiciones como declarante de Renta llegaran a cambiar.</w:t>
+        <w:t>De igual forma me comprometo a actualizar la información, en el caso de que mis condiciones como declarante de Renta llegaran a cambiar.</w:t>
       </w:r>
     </w:p>
     <w:p>
@@ -658,13 +646,7 @@
         <w:rPr>
           <w:w w:val="105"/>
         </w:rPr>
-        <w:t>Lo anterior en cumplimiento de lo previsto por parágrafo tercero del artículo 14 de la</w:t>
-      </w:r>
-      <w:r>
-        <w:rPr>
-          <w:w w:val="105"/>
-        </w:rPr>
-        <w:t xml:space="preserve"> Ley 1607 de 2012, que adicionó al artículo 384 al Estatuto Tributario y en concordancia con lo establecido por el parágrafo cuarto</w:t>
+        <w:t>Lo anterior en cumplimiento de lo previsto por parágrafo tercero del artículo 14 de la Ley 1607 de 2012, que adicionó al artículo 384 al Estatuto Tributario y en concordancia con lo establecido por el parágrafo cuarto</w:t>
       </w:r>
       <w:r>
         <w:rPr>
@@ -806,19 +788,7 @@
         <w:rPr>
           <w:rFonts w:eastAsia="Barlow" w:cs="Barlow"/>
         </w:rPr>
-        <w:t>[[</w:t>
-      </w:r>
-      <w:r>
-        <w:rPr>
-          <w:rFonts w:eastAsia="Barlow" w:cs="Barlow"/>
-        </w:rPr>
-        <w:t>Cedula</w:t>
-      </w:r>
-      <w:r>
-        <w:rPr>
-          <w:rFonts w:eastAsia="Barlow" w:cs="Barlow"/>
-        </w:rPr>
-        <w:t>]]</w:t>
+        <w:t>[[Cedula]]</w:t>
       </w:r>
     </w:p>
     <w:sectPr>

</xml_diff>